<commit_message>
Fix Hebrew RTL in catalogue docs: w:bidi must precede w:jc
The catalogue builder appended w:bidi after w:jc in pPr (and w:bidiVisual at the end of tblPr), which is schema-invalid: Word then dropped the RTL base direction and rendered Hebrew paragraphs and section headers left-to-right, scrambling mixed Hebrew/English/number lines. _set_rtl now inserts w:bidi before w:jc (and bidiVisual right after tblStyle). Regenerated and render-verified all four docs: headers and mixed lines now correct RTL.

Co-Authored-By: Claude Opus 4.8 <noreply@anthropic.com>
</commit_message>
<xml_diff>
--- a/hit-catalogue/catalogue_summary.docx
+++ b/hit-catalogue/catalogue_summary.docx
@@ -4,8 +4,8 @@
   <w:body>
     <w:p>
       <w:pPr>
+        <w:bidi/>
         <w:jc w:val="right"/>
-        <w:bidi/>
       </w:pPr>
       <w:r>
         <w:rPr>
@@ -18,8 +18,8 @@
     </w:p>
     <w:p>
       <w:pPr>
+        <w:bidi/>
         <w:jc w:val="right"/>
-        <w:bidi/>
       </w:pPr>
       <w:r>
         <w:rPr>
@@ -39,8 +39,8 @@
     </w:p>
     <w:p>
       <w:pPr>
+        <w:bidi/>
         <w:jc w:val="right"/>
-        <w:bidi/>
       </w:pPr>
       <w:r>
         <w:rPr>
@@ -51,8 +51,8 @@
     </w:p>
     <w:p>
       <w:pPr>
+        <w:bidi/>
         <w:jc w:val="right"/>
-        <w:bidi/>
       </w:pPr>
       <w:r>
         <w:rPr>
@@ -63,8 +63,8 @@
     </w:p>
     <w:p>
       <w:pPr>
+        <w:bidi/>
         <w:jc w:val="right"/>
-        <w:bidi/>
       </w:pPr>
       <w:r>
         <w:rPr>
@@ -75,8 +75,8 @@
     </w:p>
     <w:p>
       <w:pPr>
+        <w:bidi/>
         <w:jc w:val="right"/>
-        <w:bidi/>
       </w:pPr>
       <w:r>
         <w:rPr>
@@ -87,8 +87,8 @@
     </w:p>
     <w:p>
       <w:pPr>
+        <w:bidi/>
         <w:jc w:val="right"/>
-        <w:bidi/>
       </w:pPr>
       <w:r>
         <w:rPr>
@@ -99,8 +99,8 @@
     </w:p>
     <w:p>
       <w:pPr>
+        <w:bidi/>
         <w:jc w:val="right"/>
-        <w:bidi/>
       </w:pPr>
       <w:r>
         <w:rPr>

</xml_diff>

<commit_message>
Fix RTL alignment: justify (w:jc both) for Hebrew titles, headers, body
Hebrew paragraphs used w:jc='right', which Word maps to the logical end (physical LEFT) for Heading1-styled paragraphs, so section headers and the title rendered left-aligned. The HIT reference template uses w:jc='both' (justify) with bidi, which always starts at the reading edge (the right). Switched all RTL paragraphs, headings, and table cells to justify; render-verified headers now hug the right.

Co-Authored-By: Claude Opus 4.8 <noreply@anthropic.com>
</commit_message>
<xml_diff>
--- a/hit-catalogue/catalogue_summary.docx
+++ b/hit-catalogue/catalogue_summary.docx
@@ -5,7 +5,7 @@
     <w:p>
       <w:pPr>
         <w:bidi/>
-        <w:jc w:val="right"/>
+        <w:jc w:val="both"/>
       </w:pPr>
       <w:r>
         <w:rPr>
@@ -19,7 +19,7 @@
     <w:p>
       <w:pPr>
         <w:bidi/>
-        <w:jc w:val="right"/>
+        <w:jc w:val="both"/>
       </w:pPr>
       <w:r>
         <w:rPr>
@@ -40,7 +40,7 @@
     <w:p>
       <w:pPr>
         <w:bidi/>
-        <w:jc w:val="right"/>
+        <w:jc w:val="both"/>
       </w:pPr>
       <w:r>
         <w:rPr>
@@ -52,7 +52,7 @@
     <w:p>
       <w:pPr>
         <w:bidi/>
-        <w:jc w:val="right"/>
+        <w:jc w:val="both"/>
       </w:pPr>
       <w:r>
         <w:rPr>
@@ -64,7 +64,7 @@
     <w:p>
       <w:pPr>
         <w:bidi/>
-        <w:jc w:val="right"/>
+        <w:jc w:val="both"/>
       </w:pPr>
       <w:r>
         <w:rPr>
@@ -76,7 +76,7 @@
     <w:p>
       <w:pPr>
         <w:bidi/>
-        <w:jc w:val="right"/>
+        <w:jc w:val="both"/>
       </w:pPr>
       <w:r>
         <w:rPr>
@@ -88,7 +88,7 @@
     <w:p>
       <w:pPr>
         <w:bidi/>
-        <w:jc w:val="right"/>
+        <w:jc w:val="both"/>
       </w:pPr>
       <w:r>
         <w:rPr>
@@ -100,7 +100,7 @@
     <w:p>
       <w:pPr>
         <w:bidi/>
-        <w:jc w:val="right"/>
+        <w:jc w:val="both"/>
       </w:pPr>
       <w:r>
         <w:rPr>

</xml_diff>